<commit_message>
vault backup: 2026-05-12 21:47:01
</commit_message>
<xml_diff>
--- a/Учеба 4 семестр/Английский язык/Монологи/Program Design and Computer Languages.docx
+++ b/Учеба 4 семестр/Английский язык/Монологи/Program Design and Computer Languages.docx
@@ -29,10 +29,8 @@
         <w:rPr>
           <w:b/>
           <w:bCs/>
-          <w:lang w:val="ru-RU"/>
         </w:rPr>
       </w:pPr>
-      <w:proofErr w:type="spellStart"/>
       <w:r>
         <w:rPr>
           <w:b/>
@@ -41,7 +39,6 @@
         </w:rPr>
         <w:t>Эков</w:t>
       </w:r>
-      <w:proofErr w:type="spellEnd"/>
       <w:r>
         <w:rPr>
           <w:b/>
@@ -86,19 +83,25 @@
         <w:rPr>
           <w:lang w:val="ru-RU"/>
         </w:rPr>
-        <w:t>Гр.</w:t>
+        <w:t>Гр</w:t>
+      </w:r>
+      <w:r>
+        <w:t>. 515100</w:t>
       </w:r>
       <w:r>
         <w:rPr>
           <w:lang w:val="ru-RU"/>
         </w:rPr>
-        <w:t xml:space="preserve"> 5</w:t>
+        <w:t>1</w:t>
+      </w:r>
+      <w:r>
+        <w:t>/4000</w:t>
       </w:r>
       <w:r>
         <w:rPr>
           <w:lang w:val="ru-RU"/>
         </w:rPr>
-        <w:t>151004/40002</w:t>
+        <w:t>1</w:t>
       </w:r>
     </w:p>
     <w:p>
@@ -214,7 +217,6 @@
         <w:spacing w:line="448" w:lineRule="auto"/>
         <w:rPr>
           <w:spacing w:val="-2"/>
-          <w:lang w:val="ru-RU"/>
         </w:rPr>
       </w:pPr>
       <w:r>
@@ -228,9 +230,14 @@
           <w:spacing w:val="-2"/>
           <w:lang w:val="ru-RU"/>
         </w:rPr>
-        <w:t>ИКНК/</w:t>
+        <w:t>ИКНК</w:t>
       </w:r>
-      <w:proofErr w:type="spellStart"/>
+      <w:r>
+        <w:rPr>
+          <w:spacing w:val="-2"/>
+        </w:rPr>
+        <w:t>/</w:t>
+      </w:r>
       <w:r>
         <w:rPr>
           <w:spacing w:val="-2"/>
@@ -238,11 +245,9 @@
         </w:rPr>
         <w:t>ФизМех</w:t>
       </w:r>
-      <w:proofErr w:type="spellEnd"/>
       <w:r>
         <w:rPr>
           <w:spacing w:val="-2"/>
-          <w:lang w:val="ru-RU"/>
         </w:rPr>
         <w:t xml:space="preserve"> </w:t>
       </w:r>
@@ -251,9 +256,6 @@
       <w:pPr>
         <w:pStyle w:val="a4"/>
         <w:spacing w:line="448" w:lineRule="auto"/>
-        <w:rPr>
-          <w:lang w:val="ru-RU"/>
-        </w:rPr>
       </w:pPr>
     </w:p>
     <w:p>
@@ -261,9 +263,6 @@
         <w:pStyle w:val="a4"/>
         <w:spacing w:line="448" w:lineRule="auto"/>
         <w:ind w:left="0" w:firstLine="0"/>
-        <w:rPr>
-          <w:lang w:val="ru-RU"/>
-        </w:rPr>
         <w:sectPr>
           <w:type w:val="continuous"/>
           <w:pgSz w:w="11910" w:h="16840"/>
@@ -4372,14 +4371,12 @@
                 <w:sz w:val="20"/>
               </w:rPr>
             </w:pPr>
-            <w:proofErr w:type="spellStart"/>
             <w:r>
               <w:rPr>
                 <w:sz w:val="20"/>
               </w:rPr>
               <w:t>Summarise</w:t>
             </w:r>
-            <w:proofErr w:type="spellEnd"/>
             <w:r>
               <w:rPr>
                 <w:spacing w:val="-5"/>

</xml_diff>